<commit_message>
task 3: catalog consolidation — Step B projects all register entries (3c); population family merged, Scope D retrospectives excluded on record (3a); compiled-series citations by name + methodology 6.1 construction notes (3b)
Co-Authored-By: Claude Fable 5 <noreply@anthropic.com>
</commit_message>
<xml_diff>
--- a/data/methodology_v2.docx
+++ b/data/methodology_v2.docx
@@ -190,7 +190,7 @@
         <w:t xml:space="preserve">The database draws on the published statistical record of the Chilean state—censuses, anuarios estadísticos, memorias ministeriales, sinopsis estadísticas—as well as compiled academic sources (Mamalakis 1980; Aldana 1914; Humud 1969; Molina 1898; Díaz, Lüders, and Wagner 2016). </w:t>
       </w:r>
       <w:r>
-        <w:t xml:space="preserve">Version 2.0 contains 115,456 curated observations (204,605 in the full research extract) across 218 canonical source documents, covering 101 thematic indicator families and 1,033 published indicators</w:t>
+        <w:t xml:space="preserve">Version 2.0 contains 115,352 curated observations (204,605 in the full research extract) across 217 canonical source documents, covering 101 thematic indicator families and 1,033 published indicators</w:t>
       </w:r>
       <w:r>
         <w:t xml:space="preserve">. The primary focus of Phase 1 extraction is the 19th century (1810–1900), where the sources are richest and least accessible to researchers; 20th-century data from compiled sources (DLW, Mamalakis) is included where available.</w:t>
@@ -2679,6 +2679,47 @@
     <w:p>
       <w:r>
         <w:br w:type="page"/>
+      </w:r>
+    </w:p>
+    <w:p>
+      <w:pPr>
+        <w:pStyle w:val="Heading2"/>
+        <w:spacing w:after="120"/>
+      </w:pPr>
+      <w:r>
+        <w:t xml:space="preserve">6.1. Compiled series: construction notes</w:t>
+      </w:r>
+    </w:p>
+    <w:p>
+      <w:pPr>
+        <w:spacing w:after="120"/>
+      </w:pPr>
+      <w:r>
+        <w:t xml:space="preserve">Three series in the catalog are compilations assembled by the author rather than single-document extractions: the enfranchised-voter series, the public-employment series, and the 1935 commune state-capacity dataset. Each ships in the curated download under its as-printed assembly key, and the download's notes column carries the row-level audit tags. The source register cites each series by name and points here; this section records what each series contains and which primary registers feed it.</w:t>
+      </w:r>
+    </w:p>
+    <w:p>
+      <w:pPr>
+        <w:spacing w:after="120"/>
+      </w:pPr>
+      <w:r>
+        <w:t xml:space="preserve">The enfranchised-voter series covers departments from 1862 to 1920. It records qualified electors (calificados) under the pre-1888 franchise and registered voters (inscriptos) thereafter, with companion population and occupational columns. Its registers are printed tabulations: the Anuario Estadístico de la República de Chile, entrega quinta, p. 450 (calificados and population, 1862); the Anuario Estadístico correspondiente a los años de 1871 y 1872, Tomo XIII (Santiago: Imprenta Nacional, 1873) (calificados, 1872, with population from 1871); the Anuario Estadístico, Tomo XXII, p. 240 (calificados, 1881, a primary re-extraction that replaced earlier assembly values); the Anuario Estadístico 1917, Vol. III (inscriptos, 1917); the Anuario Estadístico 1920, Tomo II, p. 42 (inscriptos, 1920); and the census occupational tables of 1865, 1875, and 1920 for the occupational companions. Caveats printed in the assembly carry into the data: Chiloé includes Magallanes in 1872, and Talcahuano, Lebu, Angol, La Imperial, and Osorno print calificados combined with a neighboring department in some years. Derived per-capita columns remain outside the curated download.</w:t>
+      </w:r>
+    </w:p>
+    <w:p>
+      <w:pPr>
+        <w:spacing w:after="120"/>
+      </w:pPr>
+      <w:r>
+        <w:t xml:space="preserve">The public-employment series records public employees by department at the census years 1865 to 1920, taken from the census occupational tables (for 1920, the census volume organized by theme), with the census department population as its denominator column. The computed per-capita values remain outside the curated download; the curated rows are the printed counts.</w:t>
+      </w:r>
+    </w:p>
+    <w:p>
+      <w:pPr>
+        <w:spacing w:after="120"/>
+      </w:pPr>
+      <w:r>
+        <w:t xml:space="preserve">The 1935 commune state-capacity dataset covers 287 communes with municipal income, tax income, salaries, and public administration outlays for 1935, electoral registration and police counts for 1920, rural population share, and inquilinaje. The assembly predates this project's per-table citation standard and its workbook records variables without volume-level citations; the underlying tabulations are Chilean official commune-level statistics of the mid-1930s and the 1920 registers. Recovering the volume citations is queued as curation work; until it lands, the series is cited by name with this section as its construction record.</w:t>
       </w:r>
     </w:p>
     <w:p>

</xml_diff>